<commit_message>
deep investigation of the clusters
obtaning the researchers and keywords from each cluster of UMAP clustering and non-UMAP clustering. there's also added a draft of the conclusions obtained by the comparisons of both clustering methods results. there's remaining the visualization of the results to achieve proper comparisons
</commit_message>
<xml_diff>
--- a/_Clusterization/Investigadores y keywords/Pruebas clustering WE.docx
+++ b/_Clusterization/Investigadores y keywords/Pruebas clustering WE.docx
@@ -2889,7 +2889,6 @@
           <w:i/>
           <w:iCs/>
           <w:u w:val="single"/>
-          <w:lang w:val="en-GB"/>
         </w:rPr>
       </w:pPr>
       <w:r>
@@ -2897,7 +2896,6 @@
           <w:i/>
           <w:iCs/>
           <w:u w:val="single"/>
-          <w:lang w:val="en-GB"/>
         </w:rPr>
         <w:lastRenderedPageBreak/>
         <w:t xml:space="preserve">UMAP </w:t>
@@ -2916,41 +2914,9 @@
           <w:i/>
           <w:iCs/>
           <w:u w:val="single"/>
-          <w:lang w:val="en-GB"/>
-        </w:rPr>
-        <w:t xml:space="preserve"> </w:t>
-      </w:r>
-      <w:proofErr w:type="spellStart"/>
-      <w:r>
-        <w:rPr>
-          <w:i/>
-          <w:iCs/>
-          <w:u w:val="single"/>
-          <w:lang w:val="en-GB"/>
-        </w:rPr>
-        <w:t>Coseno</w:t>
-      </w:r>
-      <w:proofErr w:type="spellEnd"/>
-      <w:r>
-        <w:rPr>
-          <w:i/>
-          <w:iCs/>
-          <w:u w:val="single"/>
-          <w:lang w:val="en-GB"/>
-        </w:rPr>
-        <w:t xml:space="preserve"> + </w:t>
-      </w:r>
-      <w:proofErr w:type="spellStart"/>
-      <w:r>
-        <w:rPr>
-          <w:i/>
-          <w:iCs/>
-          <w:u w:val="single"/>
-          <w:lang w:val="en-GB"/>
-        </w:rPr>
-        <w:t>Jerárquico</w:t>
-      </w:r>
-      <w:proofErr w:type="spellEnd"/>
+        </w:rPr>
+        <w:t xml:space="preserve"> Coseno + Jerárquico</w:t>
+      </w:r>
     </w:p>
     <w:p>
       <w:pPr>
@@ -3197,6 +3163,9 @@
         <w:jc w:val="center"/>
       </w:pPr>
       <w:r>
+        <w:rPr>
+          <w:noProof/>
+        </w:rPr>
         <w:drawing>
           <wp:inline distT="0" distB="0" distL="0" distR="0" wp14:anchorId="00B8C937" wp14:editId="2CE3D781">
             <wp:extent cx="3371850" cy="4922617"/>
@@ -3234,6 +3203,9 @@
         </w:drawing>
       </w:r>
       <w:r>
+        <w:rPr>
+          <w:noProof/>
+        </w:rPr>
         <w:drawing>
           <wp:inline distT="0" distB="0" distL="0" distR="0" wp14:anchorId="4404CDD6" wp14:editId="13D30931">
             <wp:extent cx="1305622" cy="4933950"/>
@@ -3375,6 +3347,9 @@
         <w:jc w:val="center"/>
       </w:pPr>
       <w:r>
+        <w:rPr>
+          <w:noProof/>
+        </w:rPr>
         <w:drawing>
           <wp:inline distT="0" distB="0" distL="0" distR="0" wp14:anchorId="35DE6A1B" wp14:editId="6996DC4B">
             <wp:extent cx="3187979" cy="4923655"/>
@@ -3412,6 +3387,9 @@
         </w:drawing>
       </w:r>
       <w:r>
+        <w:rPr>
+          <w:noProof/>
+        </w:rPr>
         <w:drawing>
           <wp:inline distT="0" distB="0" distL="0" distR="0" wp14:anchorId="2ABAE2C9" wp14:editId="5E9AF52F">
             <wp:extent cx="1305622" cy="4933950"/>
@@ -3441,6 +3419,62 @@
                     <a:prstGeom prst="rect">
                       <a:avLst/>
                     </a:prstGeom>
+                  </pic:spPr>
+                </pic:pic>
+              </a:graphicData>
+            </a:graphic>
+          </wp:inline>
+        </w:drawing>
+      </w:r>
+    </w:p>
+    <w:p>
+      <w:pPr>
+        <w:jc w:val="center"/>
+      </w:pPr>
+      <w:r>
+        <w:rPr>
+          <w:noProof/>
+        </w:rPr>
+        <w:lastRenderedPageBreak/>
+        <w:drawing>
+          <wp:inline distT="0" distB="0" distL="0" distR="0" wp14:anchorId="176FAED8" wp14:editId="362D8EB8">
+            <wp:extent cx="5416262" cy="2802557"/>
+            <wp:effectExtent l="0" t="0" r="0" b="0"/>
+            <wp:docPr id="347661637" name="Imagen 2"/>
+            <wp:cNvGraphicFramePr>
+              <a:graphicFrameLocks xmlns:a="http://schemas.openxmlformats.org/drawingml/2006/main" noChangeAspect="1"/>
+            </wp:cNvGraphicFramePr>
+            <a:graphic xmlns:a="http://schemas.openxmlformats.org/drawingml/2006/main">
+              <a:graphicData uri="http://schemas.openxmlformats.org/drawingml/2006/picture">
+                <pic:pic xmlns:pic="http://schemas.openxmlformats.org/drawingml/2006/picture">
+                  <pic:nvPicPr>
+                    <pic:cNvPr id="0" name="Picture 2"/>
+                    <pic:cNvPicPr>
+                      <a:picLocks noChangeAspect="1" noChangeArrowheads="1"/>
+                    </pic:cNvPicPr>
+                  </pic:nvPicPr>
+                  <pic:blipFill>
+                    <a:blip r:embed="rId26">
+                      <a:extLst>
+                        <a:ext uri="{28A0092B-C50C-407E-A947-70E740481C1C}">
+                          <a14:useLocalDpi xmlns:a14="http://schemas.microsoft.com/office/drawing/2010/main" val="0"/>
+                        </a:ext>
+                      </a:extLst>
+                    </a:blip>
+                    <a:srcRect/>
+                    <a:stretch>
+                      <a:fillRect/>
+                    </a:stretch>
+                  </pic:blipFill>
+                  <pic:spPr bwMode="auto">
+                    <a:xfrm>
+                      <a:off x="0" y="0"/>
+                      <a:ext cx="5418918" cy="2803931"/>
+                    </a:xfrm>
+                    <a:prstGeom prst="rect">
+                      <a:avLst/>
+                    </a:prstGeom>
+                    <a:noFill/>
                   </pic:spPr>
                 </pic:pic>
               </a:graphicData>
@@ -4184,6 +4218,7 @@
   <w:style w:type="character" w:default="1" w:styleId="Fuentedeprrafopredeter">
     <w:name w:val="Default Paragraph Font"/>
     <w:uiPriority w:val="1"/>
+    <w:semiHidden/>
     <w:unhideWhenUsed/>
   </w:style>
   <w:style w:type="table" w:default="1" w:styleId="Tablanormal">

</xml_diff>

<commit_message>
deep investigation of the clusters (#19)
obtaning the researchers and keywords from each cluster of UMAP clustering and non-UMAP clustering. there's also added a draft of the conclusions obtained by the comparisons of both clustering methods results. there's remaining the visualization of the results to achieve proper comparisons
</commit_message>
<xml_diff>
--- a/_Clusterization/Investigadores y keywords/Pruebas clustering WE.docx
+++ b/_Clusterization/Investigadores y keywords/Pruebas clustering WE.docx
@@ -2889,7 +2889,6 @@
           <w:i/>
           <w:iCs/>
           <w:u w:val="single"/>
-          <w:lang w:val="en-GB"/>
         </w:rPr>
       </w:pPr>
       <w:r>
@@ -2897,7 +2896,6 @@
           <w:i/>
           <w:iCs/>
           <w:u w:val="single"/>
-          <w:lang w:val="en-GB"/>
         </w:rPr>
         <w:lastRenderedPageBreak/>
         <w:t xml:space="preserve">UMAP </w:t>
@@ -2916,41 +2914,9 @@
           <w:i/>
           <w:iCs/>
           <w:u w:val="single"/>
-          <w:lang w:val="en-GB"/>
-        </w:rPr>
-        <w:t xml:space="preserve"> </w:t>
-      </w:r>
-      <w:proofErr w:type="spellStart"/>
-      <w:r>
-        <w:rPr>
-          <w:i/>
-          <w:iCs/>
-          <w:u w:val="single"/>
-          <w:lang w:val="en-GB"/>
-        </w:rPr>
-        <w:t>Coseno</w:t>
-      </w:r>
-      <w:proofErr w:type="spellEnd"/>
-      <w:r>
-        <w:rPr>
-          <w:i/>
-          <w:iCs/>
-          <w:u w:val="single"/>
-          <w:lang w:val="en-GB"/>
-        </w:rPr>
-        <w:t xml:space="preserve"> + </w:t>
-      </w:r>
-      <w:proofErr w:type="spellStart"/>
-      <w:r>
-        <w:rPr>
-          <w:i/>
-          <w:iCs/>
-          <w:u w:val="single"/>
-          <w:lang w:val="en-GB"/>
-        </w:rPr>
-        <w:t>Jerárquico</w:t>
-      </w:r>
-      <w:proofErr w:type="spellEnd"/>
+        </w:rPr>
+        <w:t xml:space="preserve"> Coseno + Jerárquico</w:t>
+      </w:r>
     </w:p>
     <w:p>
       <w:pPr>
@@ -3197,6 +3163,9 @@
         <w:jc w:val="center"/>
       </w:pPr>
       <w:r>
+        <w:rPr>
+          <w:noProof/>
+        </w:rPr>
         <w:drawing>
           <wp:inline distT="0" distB="0" distL="0" distR="0" wp14:anchorId="00B8C937" wp14:editId="2CE3D781">
             <wp:extent cx="3371850" cy="4922617"/>
@@ -3234,6 +3203,9 @@
         </w:drawing>
       </w:r>
       <w:r>
+        <w:rPr>
+          <w:noProof/>
+        </w:rPr>
         <w:drawing>
           <wp:inline distT="0" distB="0" distL="0" distR="0" wp14:anchorId="4404CDD6" wp14:editId="13D30931">
             <wp:extent cx="1305622" cy="4933950"/>
@@ -3375,6 +3347,9 @@
         <w:jc w:val="center"/>
       </w:pPr>
       <w:r>
+        <w:rPr>
+          <w:noProof/>
+        </w:rPr>
         <w:drawing>
           <wp:inline distT="0" distB="0" distL="0" distR="0" wp14:anchorId="35DE6A1B" wp14:editId="6996DC4B">
             <wp:extent cx="3187979" cy="4923655"/>
@@ -3412,6 +3387,9 @@
         </w:drawing>
       </w:r>
       <w:r>
+        <w:rPr>
+          <w:noProof/>
+        </w:rPr>
         <w:drawing>
           <wp:inline distT="0" distB="0" distL="0" distR="0" wp14:anchorId="2ABAE2C9" wp14:editId="5E9AF52F">
             <wp:extent cx="1305622" cy="4933950"/>
@@ -3441,6 +3419,62 @@
                     <a:prstGeom prst="rect">
                       <a:avLst/>
                     </a:prstGeom>
+                  </pic:spPr>
+                </pic:pic>
+              </a:graphicData>
+            </a:graphic>
+          </wp:inline>
+        </w:drawing>
+      </w:r>
+    </w:p>
+    <w:p>
+      <w:pPr>
+        <w:jc w:val="center"/>
+      </w:pPr>
+      <w:r>
+        <w:rPr>
+          <w:noProof/>
+        </w:rPr>
+        <w:lastRenderedPageBreak/>
+        <w:drawing>
+          <wp:inline distT="0" distB="0" distL="0" distR="0" wp14:anchorId="176FAED8" wp14:editId="362D8EB8">
+            <wp:extent cx="5416262" cy="2802557"/>
+            <wp:effectExtent l="0" t="0" r="0" b="0"/>
+            <wp:docPr id="347661637" name="Imagen 2"/>
+            <wp:cNvGraphicFramePr>
+              <a:graphicFrameLocks xmlns:a="http://schemas.openxmlformats.org/drawingml/2006/main" noChangeAspect="1"/>
+            </wp:cNvGraphicFramePr>
+            <a:graphic xmlns:a="http://schemas.openxmlformats.org/drawingml/2006/main">
+              <a:graphicData uri="http://schemas.openxmlformats.org/drawingml/2006/picture">
+                <pic:pic xmlns:pic="http://schemas.openxmlformats.org/drawingml/2006/picture">
+                  <pic:nvPicPr>
+                    <pic:cNvPr id="0" name="Picture 2"/>
+                    <pic:cNvPicPr>
+                      <a:picLocks noChangeAspect="1" noChangeArrowheads="1"/>
+                    </pic:cNvPicPr>
+                  </pic:nvPicPr>
+                  <pic:blipFill>
+                    <a:blip r:embed="rId26">
+                      <a:extLst>
+                        <a:ext uri="{28A0092B-C50C-407E-A947-70E740481C1C}">
+                          <a14:useLocalDpi xmlns:a14="http://schemas.microsoft.com/office/drawing/2010/main" val="0"/>
+                        </a:ext>
+                      </a:extLst>
+                    </a:blip>
+                    <a:srcRect/>
+                    <a:stretch>
+                      <a:fillRect/>
+                    </a:stretch>
+                  </pic:blipFill>
+                  <pic:spPr bwMode="auto">
+                    <a:xfrm>
+                      <a:off x="0" y="0"/>
+                      <a:ext cx="5418918" cy="2803931"/>
+                    </a:xfrm>
+                    <a:prstGeom prst="rect">
+                      <a:avLst/>
+                    </a:prstGeom>
+                    <a:noFill/>
                   </pic:spPr>
                 </pic:pic>
               </a:graphicData>
@@ -4184,6 +4218,7 @@
   <w:style w:type="character" w:default="1" w:styleId="Fuentedeprrafopredeter">
     <w:name w:val="Default Paragraph Font"/>
     <w:uiPriority w:val="1"/>
+    <w:semiHidden/>
     <w:unhideWhenUsed/>
   </w:style>
   <w:style w:type="table" w:default="1" w:styleId="Tablanormal">

</xml_diff>